<commit_message>
upload 4_stage2_inputs_63ced5a3fc70 shared/subtitle.srt to segments/S017.mp4
</commit_message>
<xml_diff>
--- a/4_stage2_inputs_63ced5a3fc70/shared/note.docx
+++ b/4_stage2_inputs_63ced5a3fc70/shared/note.docx
@@ -7,7 +7,7 @@
         <w:pStyle w:val="Title"/>
       </w:pPr>
       <w:r>
-        <w:t>三种计算电压或电流的方法</w:t>
+        <w:t>第三课：电路分析的三种方法</w:t>
       </w:r>
     </w:p>
     <w:p>
@@ -15,7 +15,7 @@
         <w:pStyle w:val="Heading1"/>
       </w:pPr>
       <w:r>
-        <w:t>一、电路分析基础概念</w:t>
+        <w:t>一、电路拓扑基本概念</w:t>
       </w:r>
     </w:p>
     <w:p>
@@ -31,7 +31,7 @@
         <w:pStyle w:val="Heading3"/>
       </w:pPr>
       <w:r>
-        <w:t>S001 支路的定义与判断方法</w:t>
+        <w:t>S001 支路、节点、回路与网孔的定义和辨识</w:t>
       </w:r>
     </w:p>
     <w:p>
@@ -39,15 +39,7 @@
         <w:pStyle w:val="Heading3"/>
       </w:pPr>
       <w:r>
-        <w:t>S002 节点、回路和网孔的基本定义</w:t>
-      </w:r>
-    </w:p>
-    <w:p>
-      <w:pPr>
-        <w:pStyle w:val="Heading3"/>
-      </w:pPr>
-      <w:r>
-        <w:t>S003 含导线电路中的支路和节点判断规则</w:t>
+        <w:t>S002 纯导线对支路数与节点数判断的影响</w:t>
       </w:r>
     </w:p>
     <w:p>
@@ -63,7 +55,7 @@
         <w:pStyle w:val="Heading2"/>
       </w:pPr>
       <w:r>
-        <w:t>支路电流法解题步骤</w:t>
+        <w:t>三步法与例题</w:t>
       </w:r>
     </w:p>
     <w:p>
@@ -71,7 +63,7 @@
         <w:pStyle w:val="Heading3"/>
       </w:pPr>
       <w:r>
-        <w:t>S004 支路电流法整体步骤介绍</w:t>
+        <w:t>S003 支路电流法第一步：节点数与KCL电流方程</w:t>
       </w:r>
     </w:p>
     <w:p>
@@ -79,7 +71,7 @@
         <w:pStyle w:val="Heading3"/>
       </w:pPr>
       <w:r>
-        <w:t>S005 支路电流法第一步：列节点电流方程</w:t>
+        <w:t>S004 支路电流法第二步：独立回路数与KVL电压方程</w:t>
       </w:r>
     </w:p>
     <w:p>
@@ -87,7 +79,15 @@
         <w:pStyle w:val="Heading3"/>
       </w:pPr>
       <w:r>
-        <w:t>S006 支路电流法第二步和第三步：列电压方程并求解</w:t>
+        <w:t>S005 支路电流法第三步：联立方程求解支路电流</w:t>
+      </w:r>
+    </w:p>
+    <w:p>
+      <w:pPr>
+        <w:pStyle w:val="Heading3"/>
+      </w:pPr>
+      <w:r>
+        <w:t>S006 支路电流法第二例：完整三步求解I3</w:t>
       </w:r>
     </w:p>
     <w:p>
@@ -95,7 +95,7 @@
         <w:pStyle w:val="Heading1"/>
       </w:pPr>
       <w:r>
-        <w:t>三、网孔电流法</w:t>
+        <w:t>三、节点电压法</w:t>
       </w:r>
     </w:p>
     <w:p>
@@ -103,7 +103,7 @@
         <w:pStyle w:val="Heading2"/>
       </w:pPr>
       <w:r>
-        <w:t>网孔电流法解题流程</w:t>
+        <w:t>五步法与例题</w:t>
       </w:r>
     </w:p>
     <w:p>
@@ -111,7 +111,7 @@
         <w:pStyle w:val="Heading3"/>
       </w:pPr>
       <w:r>
-        <w:t>S007 网孔电流法与支路电流法的区别</w:t>
+        <w:t>S007 节点电压法第一步：选参考节点并编号</w:t>
       </w:r>
     </w:p>
     <w:p>
@@ -119,7 +119,7 @@
         <w:pStyle w:val="Heading3"/>
       </w:pPr>
       <w:r>
-        <w:t>S008 网孔电流法六步解题步骤</w:t>
+        <w:t>S008 节点电压法第二步：电源等效处理与自电导计算</w:t>
       </w:r>
     </w:p>
     <w:p>
@@ -127,7 +127,7 @@
         <w:pStyle w:val="Heading3"/>
       </w:pPr>
       <w:r>
-        <w:t>S009 网孔电流法例题：建立网孔电流方程</w:t>
+        <w:t>S009 节点电压法第三步：互电导的确定方法</w:t>
       </w:r>
     </w:p>
     <w:p>
@@ -135,7 +135,15 @@
         <w:pStyle w:val="Heading3"/>
       </w:pPr>
       <w:r>
-        <w:t>S010 网孔电流法例题：求解方程得到结果</w:t>
+        <w:t>S010 节点电压法第四步：节点等效源电流的计算</w:t>
+      </w:r>
+    </w:p>
+    <w:p>
+      <w:pPr>
+        <w:pStyle w:val="Heading3"/>
+      </w:pPr>
+      <w:r>
+        <w:t>S011 节点电压法第五步：列节点方程并求目标电压</w:t>
       </w:r>
     </w:p>
     <w:p>
@@ -143,7 +151,7 @@
         <w:pStyle w:val="Heading1"/>
       </w:pPr>
       <w:r>
-        <w:t>四、回路电流法</w:t>
+        <w:t>四、回路电流法与网孔电流法</w:t>
       </w:r>
     </w:p>
     <w:p>
@@ -151,7 +159,7 @@
         <w:pStyle w:val="Heading2"/>
       </w:pPr>
       <w:r>
-        <w:t>回路电流法解题流程</w:t>
+        <w:t>六步法与例题</w:t>
       </w:r>
     </w:p>
     <w:p>
@@ -159,7 +167,7 @@
         <w:pStyle w:val="Heading3"/>
       </w:pPr>
       <w:r>
-        <w:t>S011 回路电流法步骤与例题分析</w:t>
+        <w:t>S012 回路电流法第一步：确定独立回路与回路电流方向</w:t>
       </w:r>
     </w:p>
     <w:p>
@@ -167,7 +175,47 @@
         <w:pStyle w:val="Heading3"/>
       </w:pPr>
       <w:r>
-        <w:t>S012 网孔电流法与回路电流法总结</w:t>
+        <w:t>S013 回路电流法第二步：计算各回路自电阻</w:t>
+      </w:r>
+    </w:p>
+    <w:p>
+      <w:pPr>
+        <w:pStyle w:val="Heading3"/>
+      </w:pPr>
+      <w:r>
+        <w:t>S014 回路电流法第三步：计算回路间互电阻及符号</w:t>
+      </w:r>
+    </w:p>
+    <w:p>
+      <w:pPr>
+        <w:pStyle w:val="Heading3"/>
+      </w:pPr>
+      <w:r>
+        <w:t>S015 回路电流法第四步：计算各回路电压源代数和</w:t>
+      </w:r>
+    </w:p>
+    <w:p>
+      <w:pPr>
+        <w:pStyle w:val="Heading3"/>
+      </w:pPr>
+      <w:r>
+        <w:t>S016 回路电流法第五步：建立并求解回路方程</w:t>
+      </w:r>
+    </w:p>
+    <w:p>
+      <w:pPr>
+        <w:pStyle w:val="Heading3"/>
+      </w:pPr>
+      <w:r>
+        <w:t>S017 回路电流法第六步：由回路电流求支路电流</w:t>
+      </w:r>
+    </w:p>
+    <w:p>
+      <w:pPr>
+        <w:pStyle w:val="Heading3"/>
+      </w:pPr>
+      <w:r>
+        <w:t>S018 网孔电流法与回路电流法的区别</w:t>
       </w:r>
     </w:p>
     <w:sectPr>

</xml_diff>